<commit_message>
Separate lodging operation and property policies
</commit_message>
<xml_diff>
--- a/exports/HOME_AND_STAY_COMPREHENSIVE_OPERATIONS_MANUAL_V01_0_2026-09-04.docx
+++ b/exports/HOME_AND_STAY_COMPREHENSIVE_OPERATIONS_MANUAL_V01_0_2026-09-04.docx
@@ -31,7 +31,7 @@
         <w:pStyle w:val="Normal"/>
       </w:pPr>
       <w:r>
-        <w:t xml:space="preserve">버전: V.01.0</w:t>
+        <w:t xml:space="preserve">버전: V.01.1.1</w:t>
       </w:r>
     </w:p>
     <w:p>
@@ -47,7 +47,7 @@
         <w:pStyle w:val="Normal"/>
       </w:pPr>
       <w:r>
-        <w:t xml:space="preserve">기준일·시행일: 2026-09-04</w:t>
+        <w:t xml:space="preserve">기준일·시행일: 2026-09-07</w:t>
       </w:r>
     </w:p>
     <w:p>
@@ -2098,6 +2098,54 @@
     </w:p>
     <w:p>
       <w:pPr>
+        <w:pStyle w:val="Heading2"/>
+      </w:pPr>
+      <w:r>
+        <w:t xml:space="preserve">7.4 운영 정보와 부동산 정보 분리 정책</w:t>
+      </w:r>
+    </w:p>
+    <w:p>
+      <w:pPr>
+        <w:pStyle w:val="Normal"/>
+      </w:pPr>
+      <w:r>
+        <w:t xml:space="preserve">#### 7.4.1 지표와 탭의 권위</w:t>
+      </w:r>
+    </w:p>
+    <w:p>
+      <w:pPr>
+        <w:pStyle w:val="Normal"/>
+      </w:pPr>
+      <w:r>
+        <w:t xml:space="preserve">숙박시장 1차 지표는 활성 등록 사업체 수와 공식 객실·사이트 수다. 건물 수와 건축물대장 호수·등록 단위는 부동산 규모 또는 매칭 품질을 보조하는 2차 지표이며, 영업 규모의 대체값으로 쓰지 않는다.</w:t>
+      </w:r>
+    </w:p>
+    <w:p>
+      <w:pPr>
+        <w:pStyle w:val="Normal"/>
+      </w:pPr>
+      <w:r>
+        <w:t xml:space="preserve">운영 탭은 공식 등록 시설명, 법정 업종, 등급, 공식 재고(객실·사이트)만 표시한다. 부동산 탭은 건축물대장 명칭·용도·면적과 실거래를 표시한다. 어느 탭도 다른 도메인의 값을 조용히 fallback하거나 덮어쓰지 않는다.</w:t>
+      </w:r>
+    </w:p>
+    <w:p>
+      <w:pPr>
+        <w:pStyle w:val="Normal"/>
+      </w:pPr>
+      <w:r>
+        <w:t xml:space="preserve">#### 7.4.2 캠핑과 충돌 표기</w:t>
+      </w:r>
+    </w:p>
+    <w:p>
+      <w:pPr>
+        <w:pStyle w:val="Normal"/>
+      </w:pPr>
+      <w:r>
+        <w:t xml:space="preserve">캠핑의 법정 업종은 일반야영장업·자동차야영장업 등 허가 분류이고, 일반·자동차·글램핑·카라반·복합은 사이트 구성에 따른 운영 유형이다. 두 분류는 별도 필드로 유지한다. 서로 다른 원본의 값이 충돌하면 하나를 임의 선택하지 않고 출처와 기준일을 각각 표시한다.</w:t>
+      </w:r>
+    </w:p>
+    <w:p>
+      <w:pPr>
         <w:pStyle w:val="Heading1"/>
       </w:pPr>
       <w:r>
@@ -3272,6 +3320,35 @@
             <w:r>
               <w:rPr/>
               <w:t>데이터 수집·동기화, 숙박 통계·공개, 개인정보, 사진 정책과 운영 체크리스트를 11개 장으로 통합</w:t>
+            </w:r>
+          </w:p>
+        </w:tc>
+      </w:tr>
+      <w:tr>
+        <w:tc>
+          <w:tcPr/>
+          <w:p>
+            <w:r>
+              <w:rPr/>
+              <w:t>V.01.1.1</w:t>
+            </w:r>
+          </w:p>
+        </w:tc>
+        <w:tc>
+          <w:tcPr/>
+          <w:p>
+            <w:r>
+              <w:rPr/>
+              <w:t>2026-09-07</w:t>
+            </w:r>
+          </w:p>
+        </w:tc>
+        <w:tc>
+          <w:tcPr/>
+          <w:p>
+            <w:r>
+              <w:rPr/>
+              <w:t>운영 지표와 부동산·매칭 지표의 분리, 탭별 원본 경계와 캠핑 분류·충돌 표기 정책 추가</w:t>
             </w:r>
           </w:p>
         </w:tc>

</xml_diff>